<commit_message>
MEXT final version at the application date
</commit_message>
<xml_diff>
--- a/JAIST/MEXT/Form5_MEXT_Curriculum_Vitae.docx
+++ b/JAIST/MEXT/Form5_MEXT_Curriculum_Vitae.docx
@@ -1163,6 +1163,7 @@
                 <w:sz w:val="12"/>
               </w:rPr>
             </w:pPr>
+            <w:proofErr w:type="spellStart"/>
             <w:r>
               <w:rPr>
                 <w:rFonts w:ascii="Arial" w:hAnsi="Arial" w:cs="Arial"/>
@@ -1171,6 +1172,7 @@
               </w:rPr>
               <w:t>Panawattanakul</w:t>
             </w:r>
+            <w:proofErr w:type="spellEnd"/>
           </w:p>
         </w:tc>
         <w:tc>
@@ -1895,7 +1897,25 @@
                 <w:color w:val="000000"/>
                 <w:sz w:val="15"/>
               </w:rPr>
-              <w:t xml:space="preserve"> Plearnpattana school</w:t>
+              <w:t xml:space="preserve"> </w:t>
+            </w:r>
+            <w:proofErr w:type="spellStart"/>
+            <w:r>
+              <w:rPr>
+                <w:rFonts w:ascii="MS Mincho" w:hAnsi="MS Mincho" w:cs="Arial"/>
+                <w:color w:val="000000"/>
+                <w:sz w:val="15"/>
+              </w:rPr>
+              <w:t>Plearnpattana</w:t>
+            </w:r>
+            <w:proofErr w:type="spellEnd"/>
+            <w:r>
+              <w:rPr>
+                <w:rFonts w:ascii="MS Mincho" w:hAnsi="MS Mincho" w:cs="Arial"/>
+                <w:color w:val="000000"/>
+                <w:sz w:val="15"/>
+              </w:rPr>
+              <w:t xml:space="preserve"> school</w:t>
             </w:r>
           </w:p>
           <w:p>
@@ -2795,7 +2815,25 @@
                 <w:color w:val="000000"/>
                 <w:sz w:val="15"/>
               </w:rPr>
-              <w:t xml:space="preserve"> Plearnpattana school</w:t>
+              <w:t xml:space="preserve"> </w:t>
+            </w:r>
+            <w:proofErr w:type="spellStart"/>
+            <w:r>
+              <w:rPr>
+                <w:rFonts w:ascii="MS Mincho" w:hAnsi="MS Mincho" w:cs="Arial"/>
+                <w:color w:val="000000"/>
+                <w:sz w:val="15"/>
+              </w:rPr>
+              <w:t>Plearnpattana</w:t>
+            </w:r>
+            <w:proofErr w:type="spellEnd"/>
+            <w:r>
+              <w:rPr>
+                <w:rFonts w:ascii="MS Mincho" w:hAnsi="MS Mincho" w:cs="Arial"/>
+                <w:color w:val="000000"/>
+                <w:sz w:val="15"/>
+              </w:rPr>
+              <w:t xml:space="preserve"> school</w:t>
             </w:r>
           </w:p>
           <w:p>
@@ -3499,7 +3537,25 @@
                 <w:color w:val="000000"/>
                 <w:sz w:val="15"/>
               </w:rPr>
-              <w:t xml:space="preserve"> Plearnpattana school</w:t>
+              <w:t xml:space="preserve"> </w:t>
+            </w:r>
+            <w:proofErr w:type="spellStart"/>
+            <w:r>
+              <w:rPr>
+                <w:rFonts w:ascii="MS Mincho" w:hAnsi="MS Mincho" w:cs="Arial"/>
+                <w:color w:val="000000"/>
+                <w:sz w:val="15"/>
+              </w:rPr>
+              <w:t>Plearnpattana</w:t>
+            </w:r>
+            <w:proofErr w:type="spellEnd"/>
+            <w:r>
+              <w:rPr>
+                <w:rFonts w:ascii="MS Mincho" w:hAnsi="MS Mincho" w:cs="Arial"/>
+                <w:color w:val="000000"/>
+                <w:sz w:val="15"/>
+              </w:rPr>
+              <w:t xml:space="preserve"> school</w:t>
             </w:r>
             <w:r>
               <w:rPr>
@@ -4318,7 +4374,25 @@
                 <w:color w:val="000000"/>
                 <w:sz w:val="15"/>
               </w:rPr>
-              <w:t xml:space="preserve"> Nakornpathom, Thailand</w:t>
+              <w:t xml:space="preserve"> </w:t>
+            </w:r>
+            <w:proofErr w:type="spellStart"/>
+            <w:r>
+              <w:rPr>
+                <w:rFonts w:ascii="MS Mincho" w:hAnsi="MS Mincho" w:cs="Arial"/>
+                <w:color w:val="000000"/>
+                <w:sz w:val="15"/>
+              </w:rPr>
+              <w:t>Nakornpathom</w:t>
+            </w:r>
+            <w:proofErr w:type="spellEnd"/>
+            <w:r>
+              <w:rPr>
+                <w:rFonts w:ascii="MS Mincho" w:hAnsi="MS Mincho" w:cs="Arial"/>
+                <w:color w:val="000000"/>
+                <w:sz w:val="15"/>
+              </w:rPr>
+              <w:t>, Thailand</w:t>
             </w:r>
           </w:p>
           <w:p>
@@ -6732,14 +6806,6 @@
               </w:rPr>
               <w:t xml:space="preserve">    </w:t>
             </w:r>
-            <w:r>
-              <w:rPr>
-                <w:rFonts w:ascii="MS Mincho" w:hAnsi="MS Mincho" w:cs="Arial"/>
-                <w:color w:val="000000"/>
-                <w:sz w:val="15"/>
-              </w:rPr>
-              <w:t>Patanawattanakul Santana</w:t>
-            </w:r>
           </w:p>
         </w:tc>
         <w:tc>
@@ -6818,14 +6884,6 @@
                 <w:sz w:val="12"/>
               </w:rPr>
               <w:t xml:space="preserve">    </w:t>
-            </w:r>
-            <w:r>
-              <w:rPr>
-                <w:rFonts w:ascii="MS Mincho" w:hAnsi="MS Mincho" w:cs="Arial"/>
-                <w:color w:val="000000"/>
-                <w:sz w:val="15"/>
-              </w:rPr>
-              <w:t>Mother</w:t>
             </w:r>
           </w:p>
         </w:tc>
@@ -6871,7 +6929,7 @@
                 <w:color w:val="000000"/>
                 <w:sz w:val="15"/>
               </w:rPr>
-              <w:t xml:space="preserve">   1/58 Kanjanapisek road, Thawi watthana, Bangkok, Thailand 10170</w:t>
+              <w:t xml:space="preserve">   </w:t>
             </w:r>
           </w:p>
           <w:p>
@@ -6984,7 +7042,7 @@
                 <w:sz w:val="12"/>
                 <w:szCs w:val="12"/>
               </w:rPr>
-              <w:t xml:space="preserve"> +669885459554</w:t>
+              <w:t xml:space="preserve"> </w:t>
             </w:r>
           </w:p>
         </w:tc>
@@ -7053,7 +7111,7 @@
                 <w:sz w:val="12"/>
                 <w:szCs w:val="12"/>
               </w:rPr>
-              <w:t xml:space="preserve"> panawattanakul.santana@gmail.com</w:t>
+              <w:t xml:space="preserve"> </w:t>
             </w:r>
           </w:p>
         </w:tc>
@@ -7271,14 +7329,88 @@
               </w:rPr>
               <w:t xml:space="preserve">Name: </w:t>
             </w:r>
+            <w:proofErr w:type="spellStart"/>
             <w:r>
               <w:rPr>
                 <w:rFonts w:ascii="MS Mincho" w:hAnsi="MS Mincho"/>
                 <w:color w:val="000000"/>
                 <w:sz w:val="12"/>
               </w:rPr>
-              <w:t>Tatabányai SZC Kossuth Lajos Gazdasági és Humán Technikum</w:t>
-            </w:r>
+              <w:t>Tatabányai</w:t>
+            </w:r>
+            <w:proofErr w:type="spellEnd"/>
+            <w:r>
+              <w:rPr>
+                <w:rFonts w:ascii="MS Mincho" w:hAnsi="MS Mincho"/>
+                <w:color w:val="000000"/>
+                <w:sz w:val="12"/>
+              </w:rPr>
+              <w:t xml:space="preserve"> SZC Kossuth Lajos </w:t>
+            </w:r>
+            <w:proofErr w:type="spellStart"/>
+            <w:r>
+              <w:rPr>
+                <w:rFonts w:ascii="MS Mincho" w:hAnsi="MS Mincho"/>
+                <w:color w:val="000000"/>
+                <w:sz w:val="12"/>
+              </w:rPr>
+              <w:t>Gazdasági</w:t>
+            </w:r>
+            <w:proofErr w:type="spellEnd"/>
+            <w:r>
+              <w:rPr>
+                <w:rFonts w:ascii="MS Mincho" w:hAnsi="MS Mincho"/>
+                <w:color w:val="000000"/>
+                <w:sz w:val="12"/>
+              </w:rPr>
+              <w:t xml:space="preserve"> </w:t>
+            </w:r>
+            <w:proofErr w:type="spellStart"/>
+            <w:r>
+              <w:rPr>
+                <w:rFonts w:ascii="MS Mincho" w:hAnsi="MS Mincho"/>
+                <w:color w:val="000000"/>
+                <w:sz w:val="12"/>
+              </w:rPr>
+              <w:t>és</w:t>
+            </w:r>
+            <w:proofErr w:type="spellEnd"/>
+            <w:r>
+              <w:rPr>
+                <w:rFonts w:ascii="MS Mincho" w:hAnsi="MS Mincho"/>
+                <w:color w:val="000000"/>
+                <w:sz w:val="12"/>
+              </w:rPr>
+              <w:t xml:space="preserve"> </w:t>
+            </w:r>
+            <w:proofErr w:type="spellStart"/>
+            <w:r>
+              <w:rPr>
+                <w:rFonts w:ascii="MS Mincho" w:hAnsi="MS Mincho"/>
+                <w:color w:val="000000"/>
+                <w:sz w:val="12"/>
+              </w:rPr>
+              <w:t>Humán</w:t>
+            </w:r>
+            <w:proofErr w:type="spellEnd"/>
+            <w:r>
+              <w:rPr>
+                <w:rFonts w:ascii="MS Mincho" w:hAnsi="MS Mincho"/>
+                <w:color w:val="000000"/>
+                <w:sz w:val="12"/>
+              </w:rPr>
+              <w:t xml:space="preserve"> </w:t>
+            </w:r>
+            <w:proofErr w:type="spellStart"/>
+            <w:r>
+              <w:rPr>
+                <w:rFonts w:ascii="MS Mincho" w:hAnsi="MS Mincho"/>
+                <w:color w:val="000000"/>
+                <w:sz w:val="12"/>
+              </w:rPr>
+              <w:t>Technikum</w:t>
+            </w:r>
+            <w:proofErr w:type="spellEnd"/>
           </w:p>
           <w:p>
             <w:pPr>

</xml_diff>